<commit_message>
Sesión 2: pendientes de la sesión 1, charla de receso y anexo visual
- La sesión 2 absorbe lo que quedó pendiente de la sesión 1 (trazabilidad,
  enmascaramiento y justificación técnica); la ficha de idoneidad se
  entrega el jueves 17 antes de las 9:00.
- Charla opcional en el receso y anexo visual "De la regresión al
  transformer" en sesion-01, pedido por los participantes.
- Relojes de los ejercicios ajustados a sus bloques de agenda; el cierre
  forma los equipos para el Laboratorio 1.
- Sesión 1: se retira una lámina duplicada y un pendiente de edición.

Co-Authored-By: Claude Fable 5 <noreply@anthropic.com>
</commit_message>
<xml_diff>
--- a/sesion-02/Handout_Sesion_02.docx
+++ b/sesion-02/Handout_Sesion_02.docx
@@ -83,6 +83,59 @@
           <w:szCs w:val="21"/>
         </w:rPr>
         <w:t xml:space="preserve">Repositorio del curso: github.com/xuxoramos/curso-inegi-gen-ai</w:t>
+      </w:r>
+    </w:p>
+    <w:p>
+      <w:pPr>
+        <w:pStyle w:val="Heading1"/>
+        <w:spacing w:after="140" w:before="300"/>
+      </w:pPr>
+      <w:r>
+        <w:rPr>
+          <w:rFonts w:ascii="Arial" w:cs="Arial" w:eastAsia="Arial" w:hAnsi="Arial"/>
+          <w:b/>
+          <w:bCs/>
+          <w:color w:val="16262E"/>
+          <w:sz w:val="27"/>
+          <w:szCs w:val="27"/>
+        </w:rPr>
+        <w:t xml:space="preserve">Antes de empezar: lo pendiente de ayer</w:t>
+      </w:r>
+    </w:p>
+    <w:p>
+      <w:pPr>
+        <w:spacing w:after="120" w:line="285"/>
+        <w:jc w:val="both"/>
+      </w:pPr>
+      <w:r>
+        <w:rPr>
+          <w:rFonts w:ascii="Arial" w:cs="Arial" w:eastAsia="Arial" w:hAnsi="Arial"/>
+          <w:b w:val="false"/>
+          <w:bCs w:val="false"/>
+          <w:i w:val="false"/>
+          <w:iCs w:val="false"/>
+          <w:sz w:val="21"/>
+          <w:szCs w:val="21"/>
+        </w:rPr>
+        <w:t xml:space="preserve">La sesión 1 se quedó en la lámina 27, así que hoy se cierran tres pendientes: el marco de trazabilidad, el ejercicio de enmascaramiento y las tres preguntas de justificación técnica. El detalle completo ya está escrito en el handout de la sesión 1, secciones 3 a 5. Si no las has leído, léelas hoy: son diez minutos.</w:t>
+      </w:r>
+    </w:p>
+    <w:p>
+      <w:pPr>
+        <w:spacing w:after="120" w:line="285"/>
+        <w:jc w:val="both"/>
+      </w:pPr>
+      <w:r>
+        <w:rPr>
+          <w:rFonts w:ascii="Arial" w:cs="Arial" w:eastAsia="Arial" w:hAnsi="Arial"/>
+          <w:b w:val="false"/>
+          <w:bCs w:val="false"/>
+          <w:i w:val="false"/>
+          <w:iCs w:val="false"/>
+          <w:sz w:val="21"/>
+          <w:szCs w:val="21"/>
+        </w:rPr>
+        <w:t xml:space="preserve">La ficha de idoneidad se entrega hasta el jueves 17 antes de las 9:00, como S01_ApellidoNombre_FichaIdoneidad.docx. El cambio te conviene: después de la sesión de hoy vas a saber pedirle la crítica a Copilot mucho mejor. Y en el receso de hoy hay una charla opcional de diez minutos con el mapa técnico que varios pidieron, de la regresión al transformer. El anexo, en láminas, está en el repositorio: sesion-01/Anexo_De_la_regresion_al_transformer.pptx.</w:t>
       </w:r>
     </w:p>
     <w:p>
@@ -1195,6 +1248,7 @@
           </w:tcPr>
           <w:p>
             <w:pPr>
+              <w:keepNext/>
               <w:spacing w:after="80"/>
             </w:pPr>
             <w:r>
@@ -1210,6 +1264,7 @@
           </w:p>
           <w:p>
             <w:pPr>
+              <w:keepNext/>
               <w:spacing w:after="60" w:line="275"/>
               <w:jc w:val="both"/>
             </w:pPr>
@@ -1503,7 +1558,7 @@
                 <w:sz w:val="19"/>
                 <w:szCs w:val="19"/>
               </w:rPr>
-              <w:t xml:space="preserve">Tres prompts en tu biblioteca</w:t>
+              <w:t xml:space="preserve">Tu ficha de idoneidad</w:t>
             </w:r>
           </w:p>
         </w:tc>
@@ -1529,7 +1584,7 @@
                 <w:sz w:val="19"/>
                 <w:szCs w:val="19"/>
               </w:rPr>
-              <w:t xml:space="preserve">Cada uno con su versión inicial y su versión corregida, y una nota de qué cambiaste.</w:t>
+              <w:t xml:space="preserve">Pendiente de ayer. Por correo antes del jueves 17 a las 9:00, como S01_ApellidoNombre_FichaIdoneidad.docx. Formato 2 del archivo de formatos.</w:t>
             </w:r>
           </w:p>
         </w:tc>
@@ -1557,7 +1612,7 @@
                 <w:sz w:val="19"/>
                 <w:szCs w:val="19"/>
               </w:rPr>
-              <w:t xml:space="preserve">Tu bitácora al día</w:t>
+              <w:t xml:space="preserve">Tres prompts en tu biblioteca</w:t>
             </w:r>
           </w:p>
         </w:tc>
@@ -1583,7 +1638,7 @@
                 <w:sz w:val="19"/>
                 <w:szCs w:val="19"/>
               </w:rPr>
-              <w:t xml:space="preserve">Incluyendo los errores que encontraste en el hilo de correo y en la transcripción.</w:t>
+              <w:t xml:space="preserve">El primero lo escribes y lo corriges en clase; los otros dos los terminas hoy en casa. Cada uno con su versión inicial, su versión corregida y una nota de qué cambiaste.</w:t>
             </w:r>
           </w:p>
         </w:tc>
@@ -1611,7 +1666,7 @@
                 <w:sz w:val="19"/>
                 <w:szCs w:val="19"/>
               </w:rPr>
-              <w:t xml:space="preserve">Para el jueves</w:t>
+              <w:t xml:space="preserve">Tu bitácora al día</w:t>
             </w:r>
           </w:p>
         </w:tc>
@@ -1637,7 +1692,61 @@
                 <w:sz w:val="19"/>
                 <w:szCs w:val="19"/>
               </w:rPr>
-              <w:t xml:space="preserve">No hay que preparar nada. Se trabaja en equipos de cuatro desde el primer minuto, así que llega puntual.</w:t>
+              <w:t xml:space="preserve">Incluyendo los errores que encontraste en el hilo de correo. La transcripción de la reunión queda como práctica en casa: repite ahí el mismo ejercicio.</w:t>
+            </w:r>
+          </w:p>
+        </w:tc>
+      </w:tr>
+      <w:tr>
+        <w:tc>
+          <w:tcPr>
+            <w:tcW w:type="dxa" w:w="3000"/>
+            <w:tcMar>
+              <w:top w:type="dxa" w:w="80"/>
+              <w:left w:type="dxa" w:w="100"/>
+              <w:bottom w:type="dxa" w:w="80"/>
+              <w:right w:type="dxa" w:w="100"/>
+            </w:tcMar>
+          </w:tcPr>
+          <w:p>
+            <w:pPr>
+              <w:spacing w:after="0" w:line="275"/>
+            </w:pPr>
+            <w:r>
+              <w:rPr>
+                <w:rFonts w:ascii="Arial" w:cs="Arial" w:eastAsia="Arial" w:hAnsi="Arial"/>
+                <w:b/>
+                <w:bCs/>
+                <w:sz w:val="19"/>
+                <w:szCs w:val="19"/>
+              </w:rPr>
+              <w:t xml:space="preserve">Para el jueves</w:t>
+            </w:r>
+          </w:p>
+        </w:tc>
+        <w:tc>
+          <w:tcPr>
+            <w:tcW w:type="dxa" w:w="6360"/>
+            <w:tcMar>
+              <w:top w:type="dxa" w:w="80"/>
+              <w:left w:type="dxa" w:w="100"/>
+              <w:bottom w:type="dxa" w:w="80"/>
+              <w:right w:type="dxa" w:w="100"/>
+            </w:tcMar>
+          </w:tcPr>
+          <w:p>
+            <w:pPr>
+              <w:spacing w:after="0" w:line="275"/>
+            </w:pPr>
+            <w:r>
+              <w:rPr>
+                <w:rFonts w:ascii="Arial" w:cs="Arial" w:eastAsia="Arial" w:hAnsi="Arial"/>
+                <w:b w:val="false"/>
+                <w:bCs w:val="false"/>
+                <w:sz w:val="19"/>
+                <w:szCs w:val="19"/>
+              </w:rPr>
+              <w:t xml:space="preserve">Manda tu ficha antes de las 9:00. Los equipos quedaron formados hoy y el jueves se trabaja en equipo desde el primer minuto: llega puntual.</w:t>
             </w:r>
           </w:p>
         </w:tc>

</xml_diff>

<commit_message>
Sesión 3: calentamiento de anclaje, mapa corregido de Copilot y equipos
- En el INEGI no hay Copilot dentro de Word, Excel, Outlook ni Teams; el
  curso migra a Copilot Chat con archivos de OneDrive (comprobado en vivo).
  Lámina de referencia nueva y corrección en los handouts 2 y 3.
- La práctica de anclaje documental pendiente de la sesión 2 abre la
  sesión 3 como calentamiento de 18 minutos, con notas de ponente.
- Los equipos se forman en el receso del jueves; entregables pendientes
  reprogramados: biblioteca de prompts al viernes, hilo y transcripción
  como práctica en casa.

Co-Authored-By: Claude Fable 5 <noreply@anthropic.com>
</commit_message>
<xml_diff>
--- a/sesion-02/Handout_Sesion_02.docx
+++ b/sesion-02/Handout_Sesion_02.docx
@@ -170,7 +170,7 @@
           <w:sz w:val="21"/>
           <w:szCs w:val="21"/>
         </w:rPr>
-        <w:t xml:space="preserve">Antes de pegar cualquier cosa, averigua en cuál de los dos modos estás. Abre Word y fíjate si Copilot te ofrece hacer referencia a tus archivos. Si sí, estás dentro del contrato del Instituto.</w:t>
+        <w:t xml:space="preserve">Antes de pegar cualquier cosa, averigua en cuál de los dos modos estás. En el INEGI, Copilot no aparece dentro de Word, Excel, Outlook ni Teams: lo que tienes es Copilot Chat. Ábrelo con tu cuenta del Instituto y verifica que puedas adjuntar o referenciar tus archivos de OneDrive. Si puedes, estás dentro del contrato.</w:t>
       </w:r>
     </w:p>
     <w:tbl>
@@ -297,7 +297,7 @@
                 <w:sz w:val="19"/>
                 <w:szCs w:val="19"/>
               </w:rPr>
-              <w:t xml:space="preserve">Copilot en Word, Excel, Outlook y Teams, con acceso a SharePoint y OneDrive. Puede leer tus correos y tus archivos. Es el único lugar donde puedes trabajar con información amarilla.</w:t>
+              <w:t xml:space="preserve">Copilot Chat con tu cuenta institucional, con acceso a tus archivos de OneDrive. Es el único lugar donde puedes trabajar con información amarilla.</w:t>
             </w:r>
           </w:p>
         </w:tc>
@@ -351,7 +351,7 @@
                 <w:sz w:val="19"/>
                 <w:szCs w:val="19"/>
               </w:rPr>
-              <w:t xml:space="preserve">El chat del navegador y las demás herramientas del curso. No saben nada de tu trabajo. Solo información verde.</w:t>
+              <w:t xml:space="preserve">Copilot sin tu cuenta del Instituto y las siete herramientas gratuitas del curso. No saben nada de tu trabajo. Solo información verde.</w:t>
             </w:r>
           </w:p>
         </w:tc>

</xml_diff>